<commit_message>
feat(contracts): compute course hours from tier table, not group config
Replaces the flat group.hours value with the school's real minimum-hours
table (language x level band x day type x headcount, always anchored to
the 2-person minimum per contract policy), including the German-only
B1.2 bonus, the intensive-course cap, and youth-group tier collapsing.

Also:
- Fixes group categories to match the real contract taxonomy (drops
  "Mini" as a matching axis since English groups are just small standard
  groups; adds "Intensive" as its own category).
- Computes clause 3.4's per-headcount breakdown and the day-type-specific
  refund terms, and wires both into the real uploaded template alongside
  two new schedule lines ({datesIfThree}/{datesIfFourPlus}) that used to
  be blank underscores for manual entry.

Co-Authored-By: Claude Sonnet 5 <noreply@anthropic.com>
</commit_message>
<xml_diff>
--- a/public/templates/contract_adult_ru.docx
+++ b/public/templates/contract_adult_ru.docx
@@ -1037,49 +1037,14 @@
       <w:r>
         <w:rPr>
           <w:rFonts w:ascii="Times New Roman" w:hAnsi="Times New Roman"/>
-          <w:sz w:val="16"/>
-          <w:szCs w:val="16"/>
-          <w:lang w:val="ru-RU" w:eastAsia="ru-RU"/>
-        </w:rPr>
-        <w:t xml:space="preserve">В случае если количество учащихся в группе составляет 2 человека, объем курса составляет </w:t>
-      </w:r>
-      <w:r>
-        <w:rPr>
-          <w:rFonts w:ascii="Times New Roman" w:hAnsi="Times New Roman"/>
+          <w:i/>
           <w:color w:val="FF0000"/>
           <w:sz w:val="16"/>
           <w:szCs w:val="16"/>
-          <w:lang w:val="ru-RU" w:eastAsia="ru-RU"/>
-        </w:rPr>
-        <w:t>36</w:t>
-      </w:r>
-      <w:r>
-        <w:rPr>
-          <w:rFonts w:ascii="Times New Roman" w:hAnsi="Times New Roman"/>
-          <w:sz w:val="16"/>
-          <w:szCs w:val="16"/>
-          <w:lang w:val="ru-RU" w:eastAsia="ru-RU"/>
-        </w:rPr>
-        <w:t xml:space="preserve"> академических часов. В случае если количество учащихся в группе составляет 3 человека, объем курса составляет </w:t>
-      </w:r>
-      <w:r>
-        <w:rPr>
-          <w:rFonts w:ascii="Times New Roman" w:hAnsi="Times New Roman"/>
-          <w:color w:val="FF0000"/>
-          <w:sz w:val="16"/>
-          <w:szCs w:val="16"/>
-          <w:lang w:val="ru-RU" w:eastAsia="ru-RU"/>
-        </w:rPr>
-        <w:t>48</w:t>
-      </w:r>
-      <w:r>
-        <w:rPr>
-          <w:rFonts w:ascii="Times New Roman" w:hAnsi="Times New Roman"/>
-          <w:sz w:val="16"/>
-          <w:szCs w:val="16"/>
-          <w:lang w:val="ru-RU" w:eastAsia="ru-RU"/>
-        </w:rPr>
-        <w:t xml:space="preserve"> академических часов. </w:t>
+          <w:u w:val="single"/>
+          <w:lang w:val="ru-RU" w:eastAsia="ru-RU"/>
+        </w:rPr>
+        <w:t>{tiersClause}</w:t>
       </w:r>
     </w:p>
     <w:p>
@@ -2180,119 +2145,14 @@
       <w:r>
         <w:rPr>
           <w:rFonts w:ascii="Times New Roman" w:hAnsi="Times New Roman"/>
-          <w:sz w:val="16"/>
-          <w:szCs w:val="16"/>
-          <w:lang w:eastAsia="ru-RU"/>
-        </w:rPr>
-        <w:t xml:space="preserve">В случае отказа от участия в курсе после </w:t>
-      </w:r>
-      <w:r>
-        <w:rPr>
-          <w:rFonts w:ascii="Times New Roman" w:hAnsi="Times New Roman"/>
+          <w:i/>
           <w:color w:val="FF0000"/>
           <w:sz w:val="16"/>
           <w:szCs w:val="16"/>
-          <w:lang w:eastAsia="ru-RU"/>
-        </w:rPr>
-        <w:t>первого и второго и до третьего</w:t>
-      </w:r>
-      <w:r>
-        <w:rPr>
-          <w:rFonts w:ascii="Times New Roman" w:hAnsi="Times New Roman"/>
-          <w:sz w:val="16"/>
-          <w:szCs w:val="16"/>
-          <w:lang w:eastAsia="ru-RU"/>
-        </w:rPr>
-        <w:t xml:space="preserve"> занятия удерживается административный сбор в размере </w:t>
-      </w:r>
-      <w:r>
-        <w:rPr>
-          <w:rFonts w:ascii="Times New Roman" w:hAnsi="Times New Roman"/>
-          <w:sz w:val="16"/>
-          <w:szCs w:val="16"/>
-          <w:lang w:eastAsia="ru-RU"/>
-        </w:rPr>
-        <w:t>20</w:t>
-      </w:r>
-      <w:r>
-        <w:rPr>
-          <w:rFonts w:ascii="Times New Roman" w:hAnsi="Times New Roman"/>
-          <w:sz w:val="16"/>
-          <w:szCs w:val="16"/>
-          <w:lang w:eastAsia="ru-RU"/>
-        </w:rPr>
-        <w:t>% от полной стоимости курса в качестве расходов, понесенных Исполнителем в процессе подготовки к оказанию услуги.</w:t>
-      </w:r>
-    </w:p>
-    <w:p>
-      <w:pPr>
-        <w:pStyle w:val="10"/>
-        <w:numPr>
-          <w:ilvl w:val="2"/>
-          <w:numId w:val="5"/>
-        </w:numPr>
-        <w:jc w:val="both"/>
-        <w:rPr>
-          <w:rFonts w:ascii="Times New Roman" w:hAnsi="Times New Roman"/>
-          <w:sz w:val="16"/>
-          <w:szCs w:val="16"/>
-          <w:lang w:eastAsia="ru-RU"/>
-        </w:rPr>
-      </w:pPr>
-      <w:r>
-        <w:rPr>
-          <w:rFonts w:ascii="Times New Roman" w:hAnsi="Times New Roman"/>
-          <w:sz w:val="16"/>
-          <w:szCs w:val="16"/>
-          <w:lang w:eastAsia="ru-RU"/>
-        </w:rPr>
-        <w:t xml:space="preserve">В случае отказа от участия в курсе после </w:t>
-      </w:r>
-      <w:r>
-        <w:rPr>
-          <w:rFonts w:ascii="Times New Roman" w:hAnsi="Times New Roman"/>
-          <w:color w:val="FF0000"/>
-          <w:sz w:val="16"/>
-          <w:szCs w:val="16"/>
-          <w:lang w:eastAsia="ru-RU"/>
-        </w:rPr>
-        <w:t>третьего и четвертого и до пятого</w:t>
-      </w:r>
-      <w:r>
-        <w:rPr>
-          <w:rFonts w:ascii="Times New Roman" w:hAnsi="Times New Roman"/>
-          <w:sz w:val="16"/>
-          <w:szCs w:val="16"/>
-          <w:lang w:eastAsia="ru-RU"/>
-        </w:rPr>
-        <w:t xml:space="preserve"> занятия удерживается административный сбор в размере </w:t>
-      </w:r>
-      <w:r>
-        <w:rPr>
-          <w:rFonts w:ascii="Times New Roman" w:hAnsi="Times New Roman"/>
-          <w:sz w:val="16"/>
-          <w:szCs w:val="16"/>
-          <w:lang w:eastAsia="ru-RU"/>
-        </w:rPr>
-        <w:t>4</w:t>
-      </w:r>
-      <w:r>
-        <w:rPr>
-          <w:rFonts w:ascii="Times New Roman" w:hAnsi="Times New Roman"/>
-          <w:sz w:val="16"/>
-          <w:szCs w:val="16"/>
-          <w:lang w:eastAsia="ru-RU"/>
-        </w:rPr>
-        <w:t>0</w:t>
-      </w:r>
-      <w:r>
-        <w:rPr>
-          <w:rFonts w:ascii="Times New Roman" w:hAnsi="Times New Roman"/>
-          <w:sz w:val="16"/>
-          <w:szCs w:val="16"/>
-          <w:lang w:eastAsia="ru-RU"/>
-        </w:rPr>
-        <w:t>% от полной стоимости курса.</w:t>
+          <w:u w:val="single"/>
+          <w:lang w:eastAsia="ru-RU"/>
+        </w:rPr>
+        <w:t>{refundTerms}</w:t>
       </w:r>
     </w:p>
     <w:p>
@@ -3201,7 +3061,63 @@
                 <w:szCs w:val="16"/>
                 <w:lang w:eastAsia="ru-RU"/>
               </w:rPr>
-              <w:t>___, ___,___,___,___</w:t>
+              <w:t>{datesIfThree}</w:t>
+            </w:r>
+            <w:r>
+              <w:rPr>
+                <w:rFonts w:ascii="Times New Roman" w:hAnsi="Times New Roman"/>
+                <w:color w:val="FF0000"/>
+                <w:sz w:val="16"/>
+                <w:szCs w:val="16"/>
+                <w:lang w:eastAsia="ru-RU"/>
+              </w:rPr>
+              <w:br/>
+            </w:r>
+          </w:p>
+          <w:p>
+            <w:pPr>
+              <w:pStyle w:val="10"/>
+              <w:shd w:val="clear" w:color="auto" w:fill="FFFFFF"/>
+              <w:rPr>
+                <w:rFonts w:ascii="Times New Roman" w:hAnsi="Times New Roman"/>
+                <w:color w:val="FF0000"/>
+                <w:sz w:val="16"/>
+                <w:szCs w:val="16"/>
+                <w:lang w:eastAsia="ru-RU"/>
+              </w:rPr>
+            </w:pPr>
+            <w:r>
+              <w:rPr>
+                <w:rFonts w:ascii="Times New Roman" w:hAnsi="Times New Roman"/>
+                <w:color w:val="FF0000"/>
+                <w:sz w:val="16"/>
+                <w:szCs w:val="16"/>
+                <w:lang w:eastAsia="ru-RU"/>
+              </w:rPr>
+              <w:t>При кол-ве чел. в группе =4 и более:</w:t>
+            </w:r>
+          </w:p>
+          <w:p>
+            <w:pPr>
+              <w:pStyle w:val="10"/>
+              <w:shd w:val="clear" w:color="auto" w:fill="FFFFFF"/>
+              <w:rPr>
+                <w:rFonts w:ascii="Times New Roman" w:hAnsi="Times New Roman"/>
+                <w:color w:val="FF0000"/>
+                <w:sz w:val="16"/>
+                <w:szCs w:val="16"/>
+                <w:lang w:eastAsia="ru-RU"/>
+              </w:rPr>
+            </w:pPr>
+            <w:r>
+              <w:rPr>
+                <w:rFonts w:ascii="Times New Roman" w:hAnsi="Times New Roman"/>
+                <w:color w:val="FF0000"/>
+                <w:sz w:val="16"/>
+                <w:szCs w:val="16"/>
+                <w:lang w:eastAsia="ru-RU"/>
+              </w:rPr>
+              <w:t>{datesIfFourPlus}</w:t>
             </w:r>
             <w:r>
               <w:rPr>

</xml_diff>

<commit_message>
feat(contracts,dictionaries): add sum-in-words, fix date formatting, real dictionary data
Contracts: add amount-in-words next to the numeric price, drop the year from
month labels, and put each month's incremental dates on one line (tab-
separated) instead of splitting month and dates across lines.

Dictionaries: move to a shared store so Groups/Students dropdowns read live
values (levels, sources, audiences); replace demo levels/sources/textbooks/
course types/duration with the real school catalogs, add Аудитории, drop
payment assignment/recipient dictionaries, and make the items table always
show its edit/delete actions with no description column.

Co-Authored-By: Claude Sonnet 5 <noreply@anthropic.com>
</commit_message>
<xml_diff>
--- a/public/templates/contract_adult_ru.docx
+++ b/public/templates/contract_adult_ru.docx
@@ -1755,6 +1755,15 @@
           <w:lang w:eastAsia="ru-RU"/>
         </w:rPr>
         <w:t xml:space="preserve">{price} </w:t>
+      </w:r>
+      <w:r>
+        <w:rPr>
+          <w:rFonts w:ascii="Times New Roman" w:hAnsi="Times New Roman"/>
+          <w:sz w:val="16"/>
+          <w:szCs w:val="16"/>
+          <w:lang w:eastAsia="ru-RU"/>
+        </w:rPr>
+        <w:t xml:space="preserve">({priceWords}) </w:t>
       </w:r>
       <w:r>
         <w:rPr>

</xml_diff>